<commit_message>
added the git ignore and now this is the final version of this project
</commit_message>
<xml_diff>
--- a/Assignment2/Final Submission/report.docx
+++ b/Assignment2/Final Submission/report.docx
@@ -8,7 +8,7 @@
         <w:jc w:val="center"/>
       </w:pPr>
       <w:r>
-        <w:t>Online Retail Segmentation using RFM</w:t>
+        <w:t>Data Modelling for Online Retail</w:t>
       </w:r>
     </w:p>
     <w:p>
@@ -26,7 +26,21 @@
         <w:jc w:val="center"/>
       </w:pPr>
       <w:r>
-        <w:t>Affiliations: RMIT School of Computing technologies – Practical Data Science with Python</w:t>
+        <w:t xml:space="preserve">Affiliations: RMIT </w:t>
+      </w:r>
+      <w:r>
+        <w:t>University</w:t>
+      </w:r>
+    </w:p>
+    <w:p>
+      <w:pPr>
+        <w:jc w:val="center"/>
+      </w:pPr>
+      <w:r>
+        <w:t xml:space="preserve">Course: </w:t>
+      </w:r>
+      <w:r>
+        <w:t>Practical Data Science with Python</w:t>
       </w:r>
     </w:p>
     <w:p>
@@ -992,13 +1006,37 @@
     <w:p/>
     <w:p>
       <w:r>
-        <w:t>This report presents a customer segmentation analysis of the UCI Online Retail dataset using RFM (Recency, Frequency and Monetary) analysis. After properly looking and shifting through and then cleaning any errors by removing orders that may have been cancelled and fixing missing values, two clustering models were applied (K-means and DBSCAN</w:t>
-      </w:r>
-      <w:r>
-        <w:t>)</w:t>
-      </w:r>
-      <w:r>
-        <w:t>, K-Means with K=4 produced four clean customer segments while DBSCAN identified 7 clusters with some noise appearing on the plots. Based on the evaluation metrics K-means was seen as the best model for analysing</w:t>
+        <w:t>This report presents a customer segmentation analysis of the UCI Online Retail dataset using RFM (Recency, Frequency and Monetary) analysis. After properly looking and shifting through and then cleaning any errors by removing orders that may have been cancelled and fixing missing values</w:t>
+      </w:r>
+      <w:r>
+        <w:t>.</w:t>
+      </w:r>
+      <w:r>
+        <w:t xml:space="preserve"> </w:t>
+      </w:r>
+      <w:r>
+        <w:t>T</w:t>
+      </w:r>
+      <w:r>
+        <w:t>wo clustering models</w:t>
+      </w:r>
+      <w:r>
+        <w:t xml:space="preserve"> that</w:t>
+      </w:r>
+      <w:r>
+        <w:t xml:space="preserve"> were applied</w:t>
+      </w:r>
+      <w:r>
+        <w:t xml:space="preserve"> within this analysis were</w:t>
+      </w:r>
+      <w:r>
+        <w:t xml:space="preserve"> K-means and DBSCAN</w:t>
+      </w:r>
+      <w:r>
+        <w:t>.</w:t>
+      </w:r>
+      <w:r>
+        <w:t xml:space="preserve"> K-Means with K=4 produced four clean customer segments while DBSCAN identified 7 clusters with some noise appearing on the plots. Based on the evaluation metrics K-means was seen as the best model for analysing</w:t>
       </w:r>
       <w:r>
         <w:t xml:space="preserve"> the retail dataset</w:t>
@@ -1021,7 +1059,13 @@
     </w:p>
     <w:p>
       <w:r>
-        <w:t xml:space="preserve">The main goal of this project is to segment customers of the UK based online retail store into meaningful groups when regarding their purchasing behaviour. Understanding these groups allows the business to see what sells well and change their marketing to give a boost in accordance with customer retention. When looking at the dataset I chose a clustering approach as the dataset had no predefined labels which could allow hidden patterns in the data to be seen rather than predict an outcome. </w:t>
+        <w:t xml:space="preserve">The main goal of this </w:t>
+      </w:r>
+      <w:r>
+        <w:t>analysis</w:t>
+      </w:r>
+      <w:r>
+        <w:t xml:space="preserve"> is to segment customers of the UK based online retail store into meaningful groups when regarding their purchasing behaviour. Understanding these groups allows the business to see what sells well and change their marketing to give a boost in accordance with customer retention. When looking at the dataset I chose a clustering approach as the dataset had no predefined labels which could allow hidden patterns in the data to be seen rather than predict an outcome. </w:t>
       </w:r>
     </w:p>
     <w:p/>
@@ -1110,7 +1154,13 @@
         <w:t>c</w:t>
       </w:r>
       <w:r>
-        <w:t xml:space="preserve">olumns were then explored individually using descriptive statistics and visualisations. Histograms were mostly used for variables such as Quantity and UnitPrice, Bar charts for categorical variables such as Country and StockCode and line charts for a monthly revenue trend. Ten pairs of attributes were also explored using scatter plots and heatmaps to display and outline relationships. </w:t>
+        <w:t xml:space="preserve">olumns were then </w:t>
+      </w:r>
+      <w:r>
+        <w:t xml:space="preserve">chosen and </w:t>
+      </w:r>
+      <w:r>
+        <w:t xml:space="preserve">explored individually using descriptive statistics and visualisations. Histograms were mostly used for variables such as Quantity and UnitPrice, Bar charts for categorical variables such as Country and StockCode and line charts for a monthly revenue trend. Ten pairs of attributes were also explored using scatter plots and heatmaps to display and outline relationships. </w:t>
       </w:r>
     </w:p>
     <w:p>
@@ -1148,7 +1198,34 @@
         <w:t>revenue</w:t>
       </w:r>
       <w:r>
-        <w:t xml:space="preserve"> per month from December 2010 to December 2011. Revenue coming into the retail store remained stable in the first half of the year but then near the end of the year starting from august we see a massive jump until November peaking around 1.1 million GBP. This could be due to the holiday period which is consistent with how the business sells unique gifts for every holiday. There is a decline in December as the dataset cuts off after 9 days of the month.</w:t>
+        <w:t xml:space="preserve"> per month</w:t>
+      </w:r>
+      <w:r>
+        <w:t xml:space="preserve"> ranging</w:t>
+      </w:r>
+      <w:r>
+        <w:t xml:space="preserve"> from December 2010 to December 2011. Revenue coming into the retail store remained stable in the first half of the year but then near the end of the year starting from </w:t>
+      </w:r>
+      <w:r>
+        <w:t>A</w:t>
+      </w:r>
+      <w:r>
+        <w:t>ugust we see a massive jump until November peaking around 1.1 million GBP. This could be due to the holiday period which is consistent with how the business sells unique gifts for every holiday</w:t>
+      </w:r>
+      <w:r>
+        <w:t>, t</w:t>
+      </w:r>
+      <w:r>
+        <w:t xml:space="preserve">here is a </w:t>
+      </w:r>
+      <w:r>
+        <w:t xml:space="preserve">sharp </w:t>
+      </w:r>
+      <w:r>
+        <w:t xml:space="preserve">decline in December as the dataset cuts off after 9 days of </w:t>
+      </w:r>
+      <w:r>
+        <w:t>December.</w:t>
       </w:r>
       <w:r>
         <w:rPr>
@@ -1241,7 +1318,39 @@
       </w:pPr>
       <w:r>
         <w:lastRenderedPageBreak/>
-        <w:t>Figure 2 shows the distribution of each RFM feature across all customers. Recency is skewed to the right with many customers purchasing more recently than later in the year, this can give an idea that the business has grown, and more people have been buying. Frequency is also heavily skewed to the right with most customers placing around 1-3 orders with some customers ordering more frequently. In terms of monetary like the other graphs is skewed to the right with most of the customers spending little amounts of money.  These distributions distinguish and confirm that the need for outlier capping to be introduced before clustering can happen otherwise the results will be incorrect and distorted.</w:t>
+        <w:t>Figure 2 shows the distribution of each RFM feature</w:t>
+      </w:r>
+      <w:r>
+        <w:t>s</w:t>
+      </w:r>
+      <w:r>
+        <w:t xml:space="preserve"> across all customers. Recency is skewed to the right with many customers purchasing more recently than later in the year, this </w:t>
+      </w:r>
+      <w:r>
+        <w:t>show</w:t>
+      </w:r>
+      <w:r>
+        <w:t xml:space="preserve"> that the business has grown, and more people have been buying. Frequency is also heavily skewed to the right with most customers placing around 1-3 orders with some customers ordering more frequently. In terms of </w:t>
+      </w:r>
+      <w:r>
+        <w:t>M</w:t>
+      </w:r>
+      <w:r>
+        <w:t xml:space="preserve">onetary like the other graphs is skewed to the right with most of the customers spending little amounts of money.  These distributions distinguish and confirm that the need for outlier capping to be introduced before </w:t>
+      </w:r>
+      <w:proofErr w:type="gramStart"/>
+      <w:r>
+        <w:t xml:space="preserve">clustering </w:t>
+      </w:r>
+      <w:r>
+        <w:t>,as</w:t>
+      </w:r>
+      <w:proofErr w:type="gramEnd"/>
+      <w:r>
+        <w:t xml:space="preserve"> during the analysis</w:t>
+      </w:r>
+      <w:r>
+        <w:t xml:space="preserve"> results will be incorrect and distorted.</w:t>
       </w:r>
       <w:r>
         <w:rPr>
@@ -1254,7 +1363,7 @@
           <w:noProof/>
         </w:rPr>
         <w:drawing>
-          <wp:inline distT="0" distB="0" distL="0" distR="0" wp14:anchorId="6C9F427E" wp14:editId="038E842F">
+          <wp:inline distT="0" distB="0" distL="0" distR="0" wp14:anchorId="6C9F427E" wp14:editId="19C30858">
             <wp:extent cx="5725160" cy="1637665"/>
             <wp:effectExtent l="0" t="0" r="8890" b="635"/>
             <wp:docPr id="872886944" name="Picture 2"/>
@@ -1549,7 +1658,13 @@
     <w:p>
       <w:r>
         <w:lastRenderedPageBreak/>
-        <w:t xml:space="preserve">Figure 5 displays the relationship between Frequency and Monetary values across every customer that has ordered from the store. The main hypothesis was for to distinguish which customer has the higher spend. This scatterplot displays a positive trend where customers with a higher frequency tend to spend more money which is then confirmed by a positive correlation of 0.79. There is a concentration of points near the lower end of the axes which reflects the customers who order rarely and don’t spend much. The capping of GBP and the orders was applied to outliers present. The relationship between Frequency and Monetary values backs up the theory of if the customer makes orders the more money they will spend with the business. </w:t>
+        <w:t>Figure 5 displays the relationship between Frequency and Monetary values across every customer that has ordered from the store. The main hypothesis was for to distinguish which customer has the higher spend. This scatterplot displays a positive trend where customers with a higher frequency tend to spend more money which is then confirmed by a positive correlation of 0.79. There is a concentration of points near the lower end of the axes which reflects the customers who order rarely and don’t spend much. The capping of GBP and the orders was applied to</w:t>
+      </w:r>
+      <w:r>
+        <w:t xml:space="preserve"> the</w:t>
+      </w:r>
+      <w:r>
+        <w:t xml:space="preserve"> outliers present. The relationship between Frequency and Monetary values backs up the theory of if the customer makes orders the more money they will spend with the business. </w:t>
       </w:r>
     </w:p>
     <w:p>
@@ -1645,7 +1760,21 @@
     <w:p>
       <w:r>
         <w:lastRenderedPageBreak/>
-        <w:t xml:space="preserve">Figure 6 shows the relationship between Recency and Monetary value amongst all customers. The hypothesis for the pair is that the customers who purchased more recently will have a higher spend. The scatterplot shows a negative trend where the customers with a lower recency tend to have a higher total spend which we can see by the concentrated left side of the graph. As recent increases past the 100 days mark the monetary values start to fall off and become sparse. This is backed up by a negative correlation of -0.27 and suggests that more recent customer are the highest value customers for the business </w:t>
+        <w:t xml:space="preserve">Figure 6 shows the relationship between Recency and Monetary value amongst all customers. The hypothesis for the pair is that the customers who purchased more recently will have a higher spend. The scatterplot shows a negative trend where the customers with a lower recency tend to have a higher total spend which we can see by the concentrated left side of the graph. As recent increases past the </w:t>
+      </w:r>
+      <w:proofErr w:type="gramStart"/>
+      <w:r>
+        <w:t>100 day</w:t>
+      </w:r>
+      <w:proofErr w:type="gramEnd"/>
+      <w:r>
+        <w:t xml:space="preserve"> mark</w:t>
+      </w:r>
+      <w:r>
+        <w:t>,</w:t>
+      </w:r>
+      <w:r>
+        <w:t xml:space="preserve"> the monetary values start to fall off and become sparse. This is backed up by a negative correlation of -0.27 and suggests that more recent customer are the highest value customers for the business </w:t>
       </w:r>
     </w:p>
     <w:p>
@@ -1760,7 +1889,7 @@
           <w:noProof/>
         </w:rPr>
         <w:drawing>
-          <wp:inline distT="0" distB="0" distL="0" distR="0" wp14:anchorId="6CF61264" wp14:editId="7E404B1D">
+          <wp:inline distT="0" distB="0" distL="0" distR="0" wp14:anchorId="6CF61264" wp14:editId="2293C396">
             <wp:extent cx="5128260" cy="1369060"/>
             <wp:effectExtent l="0" t="0" r="0" b="2540"/>
             <wp:docPr id="259740483" name="Picture 6"/>
@@ -1863,7 +1992,7 @@
           <w:noProof/>
         </w:rPr>
         <w:drawing>
-          <wp:inline distT="0" distB="0" distL="0" distR="0" wp14:anchorId="179960B2" wp14:editId="0C85A60F">
+          <wp:inline distT="0" distB="0" distL="0" distR="0" wp14:anchorId="179960B2" wp14:editId="5D1FA898">
             <wp:extent cx="5725160" cy="2043430"/>
             <wp:effectExtent l="0" t="0" r="8890" b="0"/>
             <wp:docPr id="98495623" name="Picture 7"/>
@@ -1941,10 +2070,10 @@
           <w:noProof/>
         </w:rPr>
         <w:drawing>
-          <wp:inline distT="0" distB="0" distL="0" distR="0" wp14:anchorId="190C7164" wp14:editId="234B2D23">
-            <wp:extent cx="5731510" cy="1200785"/>
+          <wp:inline distT="0" distB="0" distL="0" distR="0" wp14:anchorId="000CB4EB" wp14:editId="5DA168C5">
+            <wp:extent cx="5731510" cy="1448435"/>
             <wp:effectExtent l="0" t="0" r="2540" b="0"/>
-            <wp:docPr id="948867427" name="Picture 1"/>
+            <wp:docPr id="1331439490" name="Picture 1"/>
             <wp:cNvGraphicFramePr>
               <a:graphicFrameLocks xmlns:a="http://schemas.openxmlformats.org/drawingml/2006/main" noChangeAspect="1"/>
             </wp:cNvGraphicFramePr>
@@ -1952,7 +2081,7 @@
               <a:graphicData uri="http://schemas.openxmlformats.org/drawingml/2006/picture">
                 <pic:pic xmlns:pic="http://schemas.openxmlformats.org/drawingml/2006/picture">
                   <pic:nvPicPr>
-                    <pic:cNvPr id="948867427" name=""/>
+                    <pic:cNvPr id="1331439490" name=""/>
                     <pic:cNvPicPr/>
                   </pic:nvPicPr>
                   <pic:blipFill>
@@ -1964,7 +2093,7 @@
                   <pic:spPr>
                     <a:xfrm>
                       <a:off x="0" y="0"/>
-                      <a:ext cx="5731510" cy="1200785"/>
+                      <a:ext cx="5731510" cy="1448435"/>
                     </a:xfrm>
                     <a:prstGeom prst="rect">
                       <a:avLst/>
@@ -2007,7 +2136,15 @@
         <w:t>th</w:t>
       </w:r>
       <w:r>
-        <w:t xml:space="preserve"> neighbour was calculated and plotted in descending order. The elbow of the curve occurs at approx. 0.5. This value was selected as the epsilon as points beyond the threshold would be in regions that could create noise and display totally different results. A parameter sweep across the multiple epsilon values also confirmed that 0.5 produced the more meaningful number of clusters with acceptable noise.</w:t>
+        <w:t xml:space="preserve"> neighbour was calculated and plotted in descending order. The elbow of the curve occurs at approx. 0.5. This value was selected as the epsilon as points beyond the threshold would be in regions that could create noise and display totally different results. A parameter </w:t>
+      </w:r>
+      <w:proofErr w:type="gramStart"/>
+      <w:r>
+        <w:t>sweep</w:t>
+      </w:r>
+      <w:proofErr w:type="gramEnd"/>
+      <w:r>
+        <w:t xml:space="preserve"> across the multiple epsilon values also confirmed that 0.5 produced the more meaningful number of clusters with acceptable noise.</w:t>
       </w:r>
     </w:p>
     <w:p>
@@ -2135,7 +2272,7 @@
           <w:noProof/>
         </w:rPr>
         <w:drawing>
-          <wp:inline distT="0" distB="0" distL="0" distR="0" wp14:anchorId="64B79629" wp14:editId="59618058">
+          <wp:inline distT="0" distB="0" distL="0" distR="0" wp14:anchorId="64B79629" wp14:editId="5BF83BEC">
             <wp:extent cx="5725160" cy="2043430"/>
             <wp:effectExtent l="0" t="0" r="8890" b="0"/>
             <wp:docPr id="2136660302" name="Picture 10"/>
@@ -2311,7 +2448,15 @@
         <w:t xml:space="preserve"> models are identifying similar structure in the data. K-means comes out on top due to it producing a more balanced and actionable segments. </w:t>
       </w:r>
       <w:r>
-        <w:t xml:space="preserve">DBSCAN had a better silhouette and Davies-Bouldin score than K-means but it placed the customers into a singular cluster which is difficult to use due to the customers being seen the same way. K-means however produced four correctly balanced segments that have a clear meaning behind them. For the more Champions that can have special offers and a VIP experience, Loyal customers can have regular sent emails so they can stay notified about the store, </w:t>
+        <w:t>DBSCAN had a better silhouette and Davies-Bouldin score than K-</w:t>
+      </w:r>
+      <w:proofErr w:type="gramStart"/>
+      <w:r>
+        <w:t>means</w:t>
+      </w:r>
+      <w:proofErr w:type="gramEnd"/>
+      <w:r>
+        <w:t xml:space="preserve"> but it placed the customers into a singular cluster which is difficult to use due to the customers being seen the same way. K-means however produced four correctly balanced segments that have a clear meaning behind them. For the more Champions that can have special offers and a VIP experience, Loyal customers can have regular sent emails so they can stay notified about the store, </w:t>
       </w:r>
       <w:r>
         <w:t>Customers at-</w:t>
@@ -2438,6 +2583,16 @@
           <w:t>https://archive.ics.uci.edu/dataset/352/online+retail</w:t>
         </w:r>
       </w:hyperlink>
+    </w:p>
+    <w:p>
+      <w:r>
+        <w:t>Ester, M., Kriegel, H. P., Sander, J., &amp; Xu, X. (1996). A density-based algorithm for discovering clusters in large spatial databases with noise. Proceedings of the Second International Conference on Knowledge Discovery and Data Mining (KDD-96), 226-231.</w:t>
+      </w:r>
+    </w:p>
+    <w:p>
+      <w:r>
+        <w:t>MacQueen, J. (1967). Some methods for classification and analysis of multivariate observations. Proceedings of the Fifth Berkeley Symposium on Mathematical Statistics and Probability, 1(14), 281-297.</w:t>
+      </w:r>
     </w:p>
     <w:sectPr>
       <w:pgSz w:w="11906" w:h="16838"/>

</xml_diff>